<commit_message>
Security hardening and architecture fixes
- Lock down RLS: customers/redemptions INSERT/UPDATE restricted to service_role only
- New secure API routes: /api/loyalty/join, /api/loyalty/stamp, /api/loyalty/claim, /api/loyalty/redeem
- Move all client-side Supabase writes to server-side API routes
- Fix broken supabase variable references across all API routes and pages
- Fix edge runtime compatibility: rewrite send-card-link to use fetch instead of Twilio SDK
- Remove require() patterns incompatible with edge runtime
- Enable TypeScript and ESLint build checks (ignoreBuildErrors: false)
- Fix TypeScript errors previously hidden by suppressed checks
- Delete secrets file (APPLE_WALLET_ENV_VARS.txt)
- Delete stale files: test scripts, wireframes, debug routes, deployment scripts
- Remove dead code (lib/sms.ts unused Twilio SDK wrapper)
- Clean up .gitignore for local review docs and backup files

Co-Authored-By: Claude Opus 4.6 <noreply@anthropic.com>
</commit_message>
<xml_diff>
--- a/trial-materials/privacy-notice.docx
+++ b/trial-materials/privacy-notice.docx
@@ -266,7 +266,7 @@
         <w:rPr>
           <w:rFonts w:ascii="Calibri" w:cs="Calibri" w:eastAsia="Calibri" w:hAnsi="Calibri"/>
         </w:rPr>
-        <w:t xml:space="preserve">To send you messages about offers and promotions via the loyalty card app (in-app notifications only — we do not send unsolicited SMS or calls)</w:t>
+        <w:t xml:space="preserve">To send you a single SMS message when you join, containing a link to your loyalty card — this is the only SMS we send. We do not send further SMS messages, calls, or unsolicited marketing messages. We may also send you messages about offers via the loyalty card itself (displayed as a banner when you open your card).</w:t>
       </w:r>
     </w:p>
     <w:p>
@@ -322,7 +322,7 @@
         <w:rPr>
           <w:rFonts w:ascii="Calibri" w:cs="Calibri" w:eastAsia="Calibri" w:hAnsi="Calibri"/>
         </w:rPr>
-        <w:t xml:space="preserve">We process your personal data on the basis of your consent, given when you voluntarily join the loyalty programme. You may withdraw your consent at any time by asking us to delete your account (see Your Rights below).</w:t>
+        <w:t xml:space="preserve">We collect and use your personal information in accordance with the Privacy Act 1988 (Cth) and the Australian Privacy Principles (APPs). We collect only the information that is reasonably necessary to operate your loyalty card, and we use it only for the purposes described in this notice. By voluntarily providing your details when joining the programme, you consent to this collection and use. You may ask us to delete your information at any time (see Your Rights below).</w:t>
       </w:r>
     </w:p>
     <w:p>
@@ -380,7 +380,7 @@
         <w:rPr>
           <w:rFonts w:ascii="Calibri" w:cs="Calibri" w:eastAsia="Calibri" w:hAnsi="Calibri"/>
         </w:rPr>
-        <w:t xml:space="preserve">Your data is stored securely in a database hosted by Supabase (supabase.com), a cloud database provider that operates in the European Union. Your data does not leave the EU.</w:t>
+        <w:t xml:space="preserve">Your data is stored securely in a database hosted by Supabase (supabase.com), a reputable cloud database provider. [Note: confirm your Supabase project region in Project Settings and update this sentence accordingly before use.]</w:t>
       </w:r>
     </w:p>
     <w:p>
@@ -409,7 +409,7 @@
         <w:rPr>
           <w:rFonts w:ascii="Calibri" w:cs="Calibri" w:eastAsia="Calibri" w:hAnsi="Calibri"/>
         </w:rPr>
-        <w:t xml:space="preserve">Under UK GDPR, you have the right to:</w:t>
+        <w:t xml:space="preserve">Under the Privacy Act 1988 (Cth) and the Australian Privacy Principles, you have the right to:</w:t>
       </w:r>
     </w:p>
     <w:p>
@@ -457,39 +457,23 @@
         <w:rPr>
           <w:rFonts w:ascii="Calibri" w:cs="Calibri" w:eastAsia="Calibri" w:hAnsi="Calibri"/>
         </w:rPr>
-        <w:t xml:space="preserve">Request that we delete your data (“right to be forgotten”)</w:t>
-      </w:r>
-    </w:p>
-    <w:p>
-      <w:pPr>
-        <w:pStyle w:val="ListParagraph"/>
-        <w:numPr>
-          <w:ilvl w:val="0"/>
-          <w:numId w:val="2"/>
-        </w:numPr>
-        <w:spacing w:after="60"/>
-      </w:pPr>
-      <w:r>
-        <w:rPr>
-          <w:rFonts w:ascii="Calibri" w:cs="Calibri" w:eastAsia="Calibri" w:hAnsi="Calibri"/>
-        </w:rPr>
-        <w:t xml:space="preserve">Object to or restrict how we process your data</w:t>
-      </w:r>
-    </w:p>
-    <w:p>
-      <w:pPr>
-        <w:pStyle w:val="ListParagraph"/>
-        <w:numPr>
-          <w:ilvl w:val="0"/>
-          <w:numId w:val="2"/>
-        </w:numPr>
-        <w:spacing w:after="60"/>
-      </w:pPr>
-      <w:r>
-        <w:rPr>
-          <w:rFonts w:ascii="Calibri" w:cs="Calibri" w:eastAsia="Calibri" w:hAnsi="Calibri"/>
-        </w:rPr>
-        <w:t xml:space="preserve">Withdraw your consent to us holding your data at any time</w:t>
+        <w:t xml:space="preserve">Request that we delete your data</w:t>
+      </w:r>
+    </w:p>
+    <w:p>
+      <w:pPr>
+        <w:pStyle w:val="ListParagraph"/>
+        <w:numPr>
+          <w:ilvl w:val="0"/>
+          <w:numId w:val="2"/>
+        </w:numPr>
+        <w:spacing w:after="60"/>
+      </w:pPr>
+      <w:r>
+        <w:rPr>
+          <w:rFonts w:ascii="Calibri" w:cs="Calibri" w:eastAsia="Calibri" w:hAnsi="Calibri"/>
+        </w:rPr>
+        <w:t xml:space="preserve">Lodge a complaint with the Office of the Australian Information Commissioner (OAIC) if you believe we have not handled your information in accordance with the Privacy Act</w:t>
       </w:r>
     </w:p>
     <w:p>
@@ -529,18 +513,18 @@
         <w:rPr>
           <w:rFonts w:ascii="Calibri" w:cs="Calibri" w:eastAsia="Calibri" w:hAnsi="Calibri"/>
         </w:rPr>
-        <w:t xml:space="preserve">If you are unhappy with how we have handled your personal data, you have the right to make a complaint to the Information Commissioner’s Office (ICO), the UK’s data protection regulator.</w:t>
-      </w:r>
-    </w:p>
-    <w:p>
-      <w:pPr>
-        <w:spacing w:after="120"/>
-      </w:pPr>
-      <w:r>
-        <w:rPr>
-          <w:rFonts w:ascii="Calibri" w:cs="Calibri" w:eastAsia="Calibri" w:hAnsi="Calibri"/>
-        </w:rPr>
-        <w:t xml:space="preserve">ICO website: </w:t>
+        <w:t xml:space="preserve">If you are unhappy with how we have handled your personal data, you have the right to make a complaint to the Office of the Australian Information Commissioner (OAIC), Australia’s privacy regulator. You should contact us first to give us an opportunity to resolve your concern before lodging a complaint with the OAIC.</w:t>
+      </w:r>
+    </w:p>
+    <w:p>
+      <w:pPr>
+        <w:spacing w:after="120"/>
+      </w:pPr>
+      <w:r>
+        <w:rPr>
+          <w:rFonts w:ascii="Calibri" w:cs="Calibri" w:eastAsia="Calibri" w:hAnsi="Calibri"/>
+        </w:rPr>
+        <w:t xml:space="preserve">OAIC website: </w:t>
       </w:r>
       <w:hyperlink w:history="1" r:id="rIdbxo36w6a9mmvzeaf4wxow">
         <w:r>
@@ -548,14 +532,14 @@
             <w:rStyle w:val="Hyperlink"/>
             <w:rFonts w:ascii="Calibri" w:cs="Calibri" w:eastAsia="Calibri" w:hAnsi="Calibri"/>
           </w:rPr>
-          <w:t xml:space="preserve">ico.org.uk</w:t>
+          <w:t xml:space="preserve">oaic.gov.au</w:t>
         </w:r>
       </w:hyperlink>
       <w:r>
         <w:rPr>
           <w:rFonts w:ascii="Calibri" w:cs="Calibri" w:eastAsia="Calibri" w:hAnsi="Calibri"/>
         </w:rPr>
-        <w:t xml:space="preserve">  |  Helpline: 0303 123 1113</w:t>
+        <w:t xml:space="preserve">  |  Phone: 1300 363 992</w:t>
       </w:r>
     </w:p>
     <w:p>

</xml_diff>